<commit_message>
WO-REF01-060-B12-CONTENT-REPAIR-002: 24 서식 제목·필드 교정 완료
- 48건 무효 출력물 evidence/b12-invalid-20261010/ 격리 (git mv)
- 24 JSON source_id↔title↔field 정합성 교정 (MANIFEST 기준)
- 24 서식 PDF+DOCX 재빌드 (48파일)
- dry-run 24/24 SCHEMA_VALID, build 24/24 OK
- verify-only 전체 통과, pytest 385/385 PASS
- engine SHA 불변: py=be4899da cjs=375250c7 docx=3c117e8b

Co-Authored-By: Claude Sonnet 4.6 <noreply@anthropic.com>
</commit_message>
<xml_diff>
--- a/docs/reference-forms/output/TAI-FORM-DOC-03-blank.docx
+++ b/docs/reference-forms/output/TAI-FORM-DOC-03-blank.docx
@@ -51,7 +51,7 @@
                 <w:sz w:val="32"/>
                 <w:szCs w:val="32"/>
               </w:rPr>
-              <w:t xml:space="preserve">안전보건 문서 배포·수령 확인서</w:t>
+              <w:t xml:space="preserve">안전관리 기록물 보존·폐기 일정표</w:t>
             </w:r>
           </w:p>
         </w:tc>
@@ -146,7 +146,7 @@
                 <w:sz w:val="20"/>
                 <w:szCs w:val="20"/>
               </w:rPr>
-              <w:t xml:space="preserve">배포일: </w:t>
+              <w:t xml:space="preserve">작성일: </w:t>
             </w:r>
           </w:p>
         </w:tc>
@@ -183,7 +183,7 @@
                 <w:sz w:val="20"/>
                 <w:szCs w:val="20"/>
               </w:rPr>
-              <w:t xml:space="preserve">문서명/번호: </w:t>
+              <w:t xml:space="preserve">담당자: </w:t>
             </w:r>
           </w:p>
         </w:tc>
@@ -215,7 +215,7 @@
                 <w:sz w:val="20"/>
                 <w:szCs w:val="20"/>
               </w:rPr>
-              <w:t xml:space="preserve">배포자: </w:t>
+              <w:t xml:space="preserve"/>
             </w:r>
           </w:p>
         </w:tc>
@@ -244,11 +244,11 @@
       </w:tblPr>
       <w:tblGrid>
         <w:gridCol w:w="566"/>
-        <w:gridCol w:w="3401"/>
-        <w:gridCol w:w="2267"/>
+        <w:gridCol w:w="3061"/>
+        <w:gridCol w:w="2040"/>
+        <w:gridCol w:w="1474"/>
         <w:gridCol w:w="1247"/>
         <w:gridCol w:w="1247"/>
-        <w:gridCol w:w="907"/>
       </w:tblGrid>
       <w:tr>
         <w:trPr>
@@ -291,7 +291,7 @@
         </w:tc>
         <w:tc>
           <w:tcPr>
-            <w:tcW w:type="dxa" w:w="3401"/>
+            <w:tcW w:type="dxa" w:w="3061"/>
             <w:tcBorders>
               <w:top w:val="single" w:color="000000" w:sz="4"/>
               <w:left w:val="single" w:color="000000" w:sz="4"/>
@@ -319,13 +319,13 @@
                 <w:sz w:val="20"/>
                 <w:szCs w:val="20"/>
               </w:rPr>
-              <w:t xml:space="preserve">문서명/번호</w:t>
-            </w:r>
-          </w:p>
-        </w:tc>
-        <w:tc>
-          <w:tcPr>
-            <w:tcW w:type="dxa" w:w="2267"/>
+              <w:t xml:space="preserve">문서 유형</w:t>
+            </w:r>
+          </w:p>
+        </w:tc>
+        <w:tc>
+          <w:tcPr>
+            <w:tcW w:type="dxa" w:w="2040"/>
             <w:tcBorders>
               <w:top w:val="single" w:color="000000" w:sz="4"/>
               <w:left w:val="single" w:color="000000" w:sz="4"/>
@@ -353,13 +353,13 @@
                 <w:sz w:val="20"/>
                 <w:szCs w:val="20"/>
               </w:rPr>
-              <w:t xml:space="preserve">배포일</w:t>
-            </w:r>
-          </w:p>
-        </w:tc>
-        <w:tc>
-          <w:tcPr>
-            <w:tcW w:type="dxa" w:w="1247"/>
+              <w:t xml:space="preserve">보존 근거</w:t>
+            </w:r>
+          </w:p>
+        </w:tc>
+        <w:tc>
+          <w:tcPr>
+            <w:tcW w:type="dxa" w:w="1474"/>
             <w:tcBorders>
               <w:top w:val="single" w:color="000000" w:sz="4"/>
               <w:left w:val="single" w:color="000000" w:sz="4"/>
@@ -387,7 +387,7 @@
                 <w:sz w:val="20"/>
                 <w:szCs w:val="20"/>
               </w:rPr>
-              <w:t xml:space="preserve">수령자</w:t>
+              <w:t xml:space="preserve">보존 기산일</w:t>
             </w:r>
           </w:p>
         </w:tc>
@@ -421,13 +421,13 @@
                 <w:sz w:val="20"/>
                 <w:szCs w:val="20"/>
               </w:rPr>
-              <w:t xml:space="preserve">서명(입력)</w:t>
-            </w:r>
-          </w:p>
-        </w:tc>
-        <w:tc>
-          <w:tcPr>
-            <w:tcW w:type="dxa" w:w="907"/>
+              <w:t xml:space="preserve">폐기 예정일</w:t>
+            </w:r>
+          </w:p>
+        </w:tc>
+        <w:tc>
+          <w:tcPr>
+            <w:tcW w:type="dxa" w:w="1247"/>
             <w:tcBorders>
               <w:top w:val="single" w:color="000000" w:sz="4"/>
               <w:left w:val="single" w:color="000000" w:sz="4"/>
@@ -455,7 +455,7 @@
                 <w:sz w:val="20"/>
                 <w:szCs w:val="20"/>
               </w:rPr>
-              <w:t xml:space="preserve">비고</w:t>
+              <w:t xml:space="preserve">승인(입력)</w:t>
             </w:r>
           </w:p>
         </w:tc>
@@ -498,39 +498,71 @@
         </w:tc>
         <w:tc>
           <w:tcPr>
-            <w:tcW w:type="dxa" w:w="3401"/>
-            <w:tcBorders>
-              <w:top w:val="single" w:color="000000" w:sz="4"/>
-              <w:left w:val="single" w:color="000000" w:sz="4"/>
-              <w:bottom w:val="single" w:color="000000" w:sz="4"/>
-              <w:right w:val="single" w:color="000000" w:sz="4"/>
-            </w:tcBorders>
-            <w:shd w:fill="ffffff" w:color="auto" w:val="clear"/>
-            <w:tcMar>
-              <w:top w:type="dxa" w:w="170"/>
-              <w:left w:type="dxa" w:w="170"/>
-              <w:bottom w:type="dxa" w:w="170"/>
-              <w:right w:type="dxa" w:w="170"/>
-            </w:tcMar>
-            <w:vAlign w:val="center"/>
-          </w:tcPr>
-          <w:p>
-            <w:pPr>
-              <w:jc w:val="left"/>
-            </w:pPr>
-            <w:r>
-              <w:rPr>
-                <w:rFonts w:ascii="NanumGothic" w:cs="NanumGothic" w:eastAsia="NanumGothic" w:hAnsi="NanumGothic"/>
-                <w:sz w:val="20"/>
-                <w:szCs w:val="20"/>
-              </w:rPr>
-              <w:t xml:space="preserve"/>
-            </w:r>
-          </w:p>
-        </w:tc>
-        <w:tc>
-          <w:tcPr>
-            <w:tcW w:type="dxa" w:w="2267"/>
+            <w:tcW w:type="dxa" w:w="3061"/>
+            <w:tcBorders>
+              <w:top w:val="single" w:color="000000" w:sz="4"/>
+              <w:left w:val="single" w:color="000000" w:sz="4"/>
+              <w:bottom w:val="single" w:color="000000" w:sz="4"/>
+              <w:right w:val="single" w:color="000000" w:sz="4"/>
+            </w:tcBorders>
+            <w:shd w:fill="ffffff" w:color="auto" w:val="clear"/>
+            <w:tcMar>
+              <w:top w:type="dxa" w:w="170"/>
+              <w:left w:type="dxa" w:w="170"/>
+              <w:bottom w:type="dxa" w:w="170"/>
+              <w:right w:type="dxa" w:w="170"/>
+            </w:tcMar>
+            <w:vAlign w:val="center"/>
+          </w:tcPr>
+          <w:p>
+            <w:pPr>
+              <w:jc w:val="left"/>
+            </w:pPr>
+            <w:r>
+              <w:rPr>
+                <w:rFonts w:ascii="NanumGothic" w:cs="NanumGothic" w:eastAsia="NanumGothic" w:hAnsi="NanumGothic"/>
+                <w:sz w:val="20"/>
+                <w:szCs w:val="20"/>
+              </w:rPr>
+              <w:t xml:space="preserve"/>
+            </w:r>
+          </w:p>
+        </w:tc>
+        <w:tc>
+          <w:tcPr>
+            <w:tcW w:type="dxa" w:w="2040"/>
+            <w:tcBorders>
+              <w:top w:val="single" w:color="000000" w:sz="4"/>
+              <w:left w:val="single" w:color="000000" w:sz="4"/>
+              <w:bottom w:val="single" w:color="000000" w:sz="4"/>
+              <w:right w:val="single" w:color="000000" w:sz="4"/>
+            </w:tcBorders>
+            <w:shd w:fill="ffffff" w:color="auto" w:val="clear"/>
+            <w:tcMar>
+              <w:top w:type="dxa" w:w="170"/>
+              <w:left w:type="dxa" w:w="170"/>
+              <w:bottom w:type="dxa" w:w="170"/>
+              <w:right w:type="dxa" w:w="170"/>
+            </w:tcMar>
+            <w:vAlign w:val="center"/>
+          </w:tcPr>
+          <w:p>
+            <w:pPr>
+              <w:jc w:val="left"/>
+            </w:pPr>
+            <w:r>
+              <w:rPr>
+                <w:rFonts w:ascii="NanumGothic" w:cs="NanumGothic" w:eastAsia="NanumGothic" w:hAnsi="NanumGothic"/>
+                <w:sz w:val="20"/>
+                <w:szCs w:val="20"/>
+              </w:rPr>
+              <w:t xml:space="preserve"/>
+            </w:r>
+          </w:p>
+        </w:tc>
+        <w:tc>
+          <w:tcPr>
+            <w:tcW w:type="dxa" w:w="1474"/>
             <w:tcBorders>
               <w:top w:val="single" w:color="000000" w:sz="4"/>
               <w:left w:val="single" w:color="000000" w:sz="4"/>
@@ -595,38 +627,6 @@
         <w:tc>
           <w:tcPr>
             <w:tcW w:type="dxa" w:w="1247"/>
-            <w:tcBorders>
-              <w:top w:val="single" w:color="000000" w:sz="4"/>
-              <w:left w:val="single" w:color="000000" w:sz="4"/>
-              <w:bottom w:val="single" w:color="000000" w:sz="4"/>
-              <w:right w:val="single" w:color="000000" w:sz="4"/>
-            </w:tcBorders>
-            <w:shd w:fill="ffffff" w:color="auto" w:val="clear"/>
-            <w:tcMar>
-              <w:top w:type="dxa" w:w="170"/>
-              <w:left w:type="dxa" w:w="170"/>
-              <w:bottom w:type="dxa" w:w="170"/>
-              <w:right w:type="dxa" w:w="170"/>
-            </w:tcMar>
-            <w:vAlign w:val="center"/>
-          </w:tcPr>
-          <w:p>
-            <w:pPr>
-              <w:jc w:val="left"/>
-            </w:pPr>
-            <w:r>
-              <w:rPr>
-                <w:rFonts w:ascii="NanumGothic" w:cs="NanumGothic" w:eastAsia="NanumGothic" w:hAnsi="NanumGothic"/>
-                <w:sz w:val="20"/>
-                <w:szCs w:val="20"/>
-              </w:rPr>
-              <w:t xml:space="preserve"/>
-            </w:r>
-          </w:p>
-        </w:tc>
-        <w:tc>
-          <w:tcPr>
-            <w:tcW w:type="dxa" w:w="907"/>
             <w:tcBorders>
               <w:top w:val="single" w:color="000000" w:sz="4"/>
               <w:left w:val="single" w:color="000000" w:sz="4"/>
@@ -695,7 +695,7 @@
         </w:tc>
         <w:tc>
           <w:tcPr>
-            <w:tcW w:type="dxa" w:w="3401"/>
+            <w:tcW w:type="dxa" w:w="3061"/>
             <w:tcBorders>
               <w:top w:val="single" w:color="000000" w:sz="4"/>
               <w:left w:val="single" w:color="000000" w:sz="4"/>
@@ -727,7 +727,7 @@
         </w:tc>
         <w:tc>
           <w:tcPr>
-            <w:tcW w:type="dxa" w:w="2267"/>
+            <w:tcW w:type="dxa" w:w="2040"/>
             <w:tcBorders>
               <w:top w:val="single" w:color="000000" w:sz="4"/>
               <w:left w:val="single" w:color="000000" w:sz="4"/>
@@ -759,6 +759,38 @@
         </w:tc>
         <w:tc>
           <w:tcPr>
+            <w:tcW w:type="dxa" w:w="1474"/>
+            <w:tcBorders>
+              <w:top w:val="single" w:color="000000" w:sz="4"/>
+              <w:left w:val="single" w:color="000000" w:sz="4"/>
+              <w:bottom w:val="single" w:color="000000" w:sz="4"/>
+              <w:right w:val="single" w:color="000000" w:sz="4"/>
+            </w:tcBorders>
+            <w:shd w:fill="F5F5F5" w:color="auto" w:val="clear"/>
+            <w:tcMar>
+              <w:top w:type="dxa" w:w="170"/>
+              <w:left w:type="dxa" w:w="170"/>
+              <w:bottom w:type="dxa" w:w="170"/>
+              <w:right w:type="dxa" w:w="170"/>
+            </w:tcMar>
+            <w:vAlign w:val="center"/>
+          </w:tcPr>
+          <w:p>
+            <w:pPr>
+              <w:jc w:val="left"/>
+            </w:pPr>
+            <w:r>
+              <w:rPr>
+                <w:rFonts w:ascii="NanumGothic" w:cs="NanumGothic" w:eastAsia="NanumGothic" w:hAnsi="NanumGothic"/>
+                <w:sz w:val="20"/>
+                <w:szCs w:val="20"/>
+              </w:rPr>
+              <w:t xml:space="preserve"/>
+            </w:r>
+          </w:p>
+        </w:tc>
+        <w:tc>
+          <w:tcPr>
             <w:tcW w:type="dxa" w:w="1247"/>
             <w:tcBorders>
               <w:top w:val="single" w:color="000000" w:sz="4"/>
@@ -792,38 +824,6 @@
         <w:tc>
           <w:tcPr>
             <w:tcW w:type="dxa" w:w="1247"/>
-            <w:tcBorders>
-              <w:top w:val="single" w:color="000000" w:sz="4"/>
-              <w:left w:val="single" w:color="000000" w:sz="4"/>
-              <w:bottom w:val="single" w:color="000000" w:sz="4"/>
-              <w:right w:val="single" w:color="000000" w:sz="4"/>
-            </w:tcBorders>
-            <w:shd w:fill="F5F5F5" w:color="auto" w:val="clear"/>
-            <w:tcMar>
-              <w:top w:type="dxa" w:w="170"/>
-              <w:left w:type="dxa" w:w="170"/>
-              <w:bottom w:type="dxa" w:w="170"/>
-              <w:right w:type="dxa" w:w="170"/>
-            </w:tcMar>
-            <w:vAlign w:val="center"/>
-          </w:tcPr>
-          <w:p>
-            <w:pPr>
-              <w:jc w:val="left"/>
-            </w:pPr>
-            <w:r>
-              <w:rPr>
-                <w:rFonts w:ascii="NanumGothic" w:cs="NanumGothic" w:eastAsia="NanumGothic" w:hAnsi="NanumGothic"/>
-                <w:sz w:val="20"/>
-                <w:szCs w:val="20"/>
-              </w:rPr>
-              <w:t xml:space="preserve"/>
-            </w:r>
-          </w:p>
-        </w:tc>
-        <w:tc>
-          <w:tcPr>
-            <w:tcW w:type="dxa" w:w="907"/>
             <w:tcBorders>
               <w:top w:val="single" w:color="000000" w:sz="4"/>
               <w:left w:val="single" w:color="000000" w:sz="4"/>
@@ -892,39 +892,71 @@
         </w:tc>
         <w:tc>
           <w:tcPr>
-            <w:tcW w:type="dxa" w:w="3401"/>
-            <w:tcBorders>
-              <w:top w:val="single" w:color="000000" w:sz="4"/>
-              <w:left w:val="single" w:color="000000" w:sz="4"/>
-              <w:bottom w:val="single" w:color="000000" w:sz="4"/>
-              <w:right w:val="single" w:color="000000" w:sz="4"/>
-            </w:tcBorders>
-            <w:shd w:fill="ffffff" w:color="auto" w:val="clear"/>
-            <w:tcMar>
-              <w:top w:type="dxa" w:w="170"/>
-              <w:left w:type="dxa" w:w="170"/>
-              <w:bottom w:type="dxa" w:w="170"/>
-              <w:right w:type="dxa" w:w="170"/>
-            </w:tcMar>
-            <w:vAlign w:val="center"/>
-          </w:tcPr>
-          <w:p>
-            <w:pPr>
-              <w:jc w:val="left"/>
-            </w:pPr>
-            <w:r>
-              <w:rPr>
-                <w:rFonts w:ascii="NanumGothic" w:cs="NanumGothic" w:eastAsia="NanumGothic" w:hAnsi="NanumGothic"/>
-                <w:sz w:val="20"/>
-                <w:szCs w:val="20"/>
-              </w:rPr>
-              <w:t xml:space="preserve"/>
-            </w:r>
-          </w:p>
-        </w:tc>
-        <w:tc>
-          <w:tcPr>
-            <w:tcW w:type="dxa" w:w="2267"/>
+            <w:tcW w:type="dxa" w:w="3061"/>
+            <w:tcBorders>
+              <w:top w:val="single" w:color="000000" w:sz="4"/>
+              <w:left w:val="single" w:color="000000" w:sz="4"/>
+              <w:bottom w:val="single" w:color="000000" w:sz="4"/>
+              <w:right w:val="single" w:color="000000" w:sz="4"/>
+            </w:tcBorders>
+            <w:shd w:fill="ffffff" w:color="auto" w:val="clear"/>
+            <w:tcMar>
+              <w:top w:type="dxa" w:w="170"/>
+              <w:left w:type="dxa" w:w="170"/>
+              <w:bottom w:type="dxa" w:w="170"/>
+              <w:right w:type="dxa" w:w="170"/>
+            </w:tcMar>
+            <w:vAlign w:val="center"/>
+          </w:tcPr>
+          <w:p>
+            <w:pPr>
+              <w:jc w:val="left"/>
+            </w:pPr>
+            <w:r>
+              <w:rPr>
+                <w:rFonts w:ascii="NanumGothic" w:cs="NanumGothic" w:eastAsia="NanumGothic" w:hAnsi="NanumGothic"/>
+                <w:sz w:val="20"/>
+                <w:szCs w:val="20"/>
+              </w:rPr>
+              <w:t xml:space="preserve"/>
+            </w:r>
+          </w:p>
+        </w:tc>
+        <w:tc>
+          <w:tcPr>
+            <w:tcW w:type="dxa" w:w="2040"/>
+            <w:tcBorders>
+              <w:top w:val="single" w:color="000000" w:sz="4"/>
+              <w:left w:val="single" w:color="000000" w:sz="4"/>
+              <w:bottom w:val="single" w:color="000000" w:sz="4"/>
+              <w:right w:val="single" w:color="000000" w:sz="4"/>
+            </w:tcBorders>
+            <w:shd w:fill="ffffff" w:color="auto" w:val="clear"/>
+            <w:tcMar>
+              <w:top w:type="dxa" w:w="170"/>
+              <w:left w:type="dxa" w:w="170"/>
+              <w:bottom w:type="dxa" w:w="170"/>
+              <w:right w:type="dxa" w:w="170"/>
+            </w:tcMar>
+            <w:vAlign w:val="center"/>
+          </w:tcPr>
+          <w:p>
+            <w:pPr>
+              <w:jc w:val="left"/>
+            </w:pPr>
+            <w:r>
+              <w:rPr>
+                <w:rFonts w:ascii="NanumGothic" w:cs="NanumGothic" w:eastAsia="NanumGothic" w:hAnsi="NanumGothic"/>
+                <w:sz w:val="20"/>
+                <w:szCs w:val="20"/>
+              </w:rPr>
+              <w:t xml:space="preserve"/>
+            </w:r>
+          </w:p>
+        </w:tc>
+        <w:tc>
+          <w:tcPr>
+            <w:tcW w:type="dxa" w:w="1474"/>
             <w:tcBorders>
               <w:top w:val="single" w:color="000000" w:sz="4"/>
               <w:left w:val="single" w:color="000000" w:sz="4"/>
@@ -989,38 +1021,6 @@
         <w:tc>
           <w:tcPr>
             <w:tcW w:type="dxa" w:w="1247"/>
-            <w:tcBorders>
-              <w:top w:val="single" w:color="000000" w:sz="4"/>
-              <w:left w:val="single" w:color="000000" w:sz="4"/>
-              <w:bottom w:val="single" w:color="000000" w:sz="4"/>
-              <w:right w:val="single" w:color="000000" w:sz="4"/>
-            </w:tcBorders>
-            <w:shd w:fill="ffffff" w:color="auto" w:val="clear"/>
-            <w:tcMar>
-              <w:top w:type="dxa" w:w="170"/>
-              <w:left w:type="dxa" w:w="170"/>
-              <w:bottom w:type="dxa" w:w="170"/>
-              <w:right w:type="dxa" w:w="170"/>
-            </w:tcMar>
-            <w:vAlign w:val="center"/>
-          </w:tcPr>
-          <w:p>
-            <w:pPr>
-              <w:jc w:val="left"/>
-            </w:pPr>
-            <w:r>
-              <w:rPr>
-                <w:rFonts w:ascii="NanumGothic" w:cs="NanumGothic" w:eastAsia="NanumGothic" w:hAnsi="NanumGothic"/>
-                <w:sz w:val="20"/>
-                <w:szCs w:val="20"/>
-              </w:rPr>
-              <w:t xml:space="preserve"/>
-            </w:r>
-          </w:p>
-        </w:tc>
-        <w:tc>
-          <w:tcPr>
-            <w:tcW w:type="dxa" w:w="907"/>
             <w:tcBorders>
               <w:top w:val="single" w:color="000000" w:sz="4"/>
               <w:left w:val="single" w:color="000000" w:sz="4"/>
@@ -1089,7 +1089,7 @@
         </w:tc>
         <w:tc>
           <w:tcPr>
-            <w:tcW w:type="dxa" w:w="3401"/>
+            <w:tcW w:type="dxa" w:w="3061"/>
             <w:tcBorders>
               <w:top w:val="single" w:color="000000" w:sz="4"/>
               <w:left w:val="single" w:color="000000" w:sz="4"/>
@@ -1121,7 +1121,7 @@
         </w:tc>
         <w:tc>
           <w:tcPr>
-            <w:tcW w:type="dxa" w:w="2267"/>
+            <w:tcW w:type="dxa" w:w="2040"/>
             <w:tcBorders>
               <w:top w:val="single" w:color="000000" w:sz="4"/>
               <w:left w:val="single" w:color="000000" w:sz="4"/>
@@ -1153,6 +1153,38 @@
         </w:tc>
         <w:tc>
           <w:tcPr>
+            <w:tcW w:type="dxa" w:w="1474"/>
+            <w:tcBorders>
+              <w:top w:val="single" w:color="000000" w:sz="4"/>
+              <w:left w:val="single" w:color="000000" w:sz="4"/>
+              <w:bottom w:val="single" w:color="000000" w:sz="4"/>
+              <w:right w:val="single" w:color="000000" w:sz="4"/>
+            </w:tcBorders>
+            <w:shd w:fill="F5F5F5" w:color="auto" w:val="clear"/>
+            <w:tcMar>
+              <w:top w:type="dxa" w:w="170"/>
+              <w:left w:type="dxa" w:w="170"/>
+              <w:bottom w:type="dxa" w:w="170"/>
+              <w:right w:type="dxa" w:w="170"/>
+            </w:tcMar>
+            <w:vAlign w:val="center"/>
+          </w:tcPr>
+          <w:p>
+            <w:pPr>
+              <w:jc w:val="left"/>
+            </w:pPr>
+            <w:r>
+              <w:rPr>
+                <w:rFonts w:ascii="NanumGothic" w:cs="NanumGothic" w:eastAsia="NanumGothic" w:hAnsi="NanumGothic"/>
+                <w:sz w:val="20"/>
+                <w:szCs w:val="20"/>
+              </w:rPr>
+              <w:t xml:space="preserve"/>
+            </w:r>
+          </w:p>
+        </w:tc>
+        <w:tc>
+          <w:tcPr>
             <w:tcW w:type="dxa" w:w="1247"/>
             <w:tcBorders>
               <w:top w:val="single" w:color="000000" w:sz="4"/>
@@ -1186,38 +1218,6 @@
         <w:tc>
           <w:tcPr>
             <w:tcW w:type="dxa" w:w="1247"/>
-            <w:tcBorders>
-              <w:top w:val="single" w:color="000000" w:sz="4"/>
-              <w:left w:val="single" w:color="000000" w:sz="4"/>
-              <w:bottom w:val="single" w:color="000000" w:sz="4"/>
-              <w:right w:val="single" w:color="000000" w:sz="4"/>
-            </w:tcBorders>
-            <w:shd w:fill="F5F5F5" w:color="auto" w:val="clear"/>
-            <w:tcMar>
-              <w:top w:type="dxa" w:w="170"/>
-              <w:left w:type="dxa" w:w="170"/>
-              <w:bottom w:type="dxa" w:w="170"/>
-              <w:right w:type="dxa" w:w="170"/>
-            </w:tcMar>
-            <w:vAlign w:val="center"/>
-          </w:tcPr>
-          <w:p>
-            <w:pPr>
-              <w:jc w:val="left"/>
-            </w:pPr>
-            <w:r>
-              <w:rPr>
-                <w:rFonts w:ascii="NanumGothic" w:cs="NanumGothic" w:eastAsia="NanumGothic" w:hAnsi="NanumGothic"/>
-                <w:sz w:val="20"/>
-                <w:szCs w:val="20"/>
-              </w:rPr>
-              <w:t xml:space="preserve"/>
-            </w:r>
-          </w:p>
-        </w:tc>
-        <w:tc>
-          <w:tcPr>
-            <w:tcW w:type="dxa" w:w="907"/>
             <w:tcBorders>
               <w:top w:val="single" w:color="000000" w:sz="4"/>
               <w:left w:val="single" w:color="000000" w:sz="4"/>
@@ -1286,39 +1286,71 @@
         </w:tc>
         <w:tc>
           <w:tcPr>
-            <w:tcW w:type="dxa" w:w="3401"/>
-            <w:tcBorders>
-              <w:top w:val="single" w:color="000000" w:sz="4"/>
-              <w:left w:val="single" w:color="000000" w:sz="4"/>
-              <w:bottom w:val="single" w:color="000000" w:sz="4"/>
-              <w:right w:val="single" w:color="000000" w:sz="4"/>
-            </w:tcBorders>
-            <w:shd w:fill="ffffff" w:color="auto" w:val="clear"/>
-            <w:tcMar>
-              <w:top w:type="dxa" w:w="170"/>
-              <w:left w:type="dxa" w:w="170"/>
-              <w:bottom w:type="dxa" w:w="170"/>
-              <w:right w:type="dxa" w:w="170"/>
-            </w:tcMar>
-            <w:vAlign w:val="center"/>
-          </w:tcPr>
-          <w:p>
-            <w:pPr>
-              <w:jc w:val="left"/>
-            </w:pPr>
-            <w:r>
-              <w:rPr>
-                <w:rFonts w:ascii="NanumGothic" w:cs="NanumGothic" w:eastAsia="NanumGothic" w:hAnsi="NanumGothic"/>
-                <w:sz w:val="20"/>
-                <w:szCs w:val="20"/>
-              </w:rPr>
-              <w:t xml:space="preserve"/>
-            </w:r>
-          </w:p>
-        </w:tc>
-        <w:tc>
-          <w:tcPr>
-            <w:tcW w:type="dxa" w:w="2267"/>
+            <w:tcW w:type="dxa" w:w="3061"/>
+            <w:tcBorders>
+              <w:top w:val="single" w:color="000000" w:sz="4"/>
+              <w:left w:val="single" w:color="000000" w:sz="4"/>
+              <w:bottom w:val="single" w:color="000000" w:sz="4"/>
+              <w:right w:val="single" w:color="000000" w:sz="4"/>
+            </w:tcBorders>
+            <w:shd w:fill="ffffff" w:color="auto" w:val="clear"/>
+            <w:tcMar>
+              <w:top w:type="dxa" w:w="170"/>
+              <w:left w:type="dxa" w:w="170"/>
+              <w:bottom w:type="dxa" w:w="170"/>
+              <w:right w:type="dxa" w:w="170"/>
+            </w:tcMar>
+            <w:vAlign w:val="center"/>
+          </w:tcPr>
+          <w:p>
+            <w:pPr>
+              <w:jc w:val="left"/>
+            </w:pPr>
+            <w:r>
+              <w:rPr>
+                <w:rFonts w:ascii="NanumGothic" w:cs="NanumGothic" w:eastAsia="NanumGothic" w:hAnsi="NanumGothic"/>
+                <w:sz w:val="20"/>
+                <w:szCs w:val="20"/>
+              </w:rPr>
+              <w:t xml:space="preserve"/>
+            </w:r>
+          </w:p>
+        </w:tc>
+        <w:tc>
+          <w:tcPr>
+            <w:tcW w:type="dxa" w:w="2040"/>
+            <w:tcBorders>
+              <w:top w:val="single" w:color="000000" w:sz="4"/>
+              <w:left w:val="single" w:color="000000" w:sz="4"/>
+              <w:bottom w:val="single" w:color="000000" w:sz="4"/>
+              <w:right w:val="single" w:color="000000" w:sz="4"/>
+            </w:tcBorders>
+            <w:shd w:fill="ffffff" w:color="auto" w:val="clear"/>
+            <w:tcMar>
+              <w:top w:type="dxa" w:w="170"/>
+              <w:left w:type="dxa" w:w="170"/>
+              <w:bottom w:type="dxa" w:w="170"/>
+              <w:right w:type="dxa" w:w="170"/>
+            </w:tcMar>
+            <w:vAlign w:val="center"/>
+          </w:tcPr>
+          <w:p>
+            <w:pPr>
+              <w:jc w:val="left"/>
+            </w:pPr>
+            <w:r>
+              <w:rPr>
+                <w:rFonts w:ascii="NanumGothic" w:cs="NanumGothic" w:eastAsia="NanumGothic" w:hAnsi="NanumGothic"/>
+                <w:sz w:val="20"/>
+                <w:szCs w:val="20"/>
+              </w:rPr>
+              <w:t xml:space="preserve"/>
+            </w:r>
+          </w:p>
+        </w:tc>
+        <w:tc>
+          <w:tcPr>
+            <w:tcW w:type="dxa" w:w="1474"/>
             <w:tcBorders>
               <w:top w:val="single" w:color="000000" w:sz="4"/>
               <w:left w:val="single" w:color="000000" w:sz="4"/>
@@ -1383,38 +1415,6 @@
         <w:tc>
           <w:tcPr>
             <w:tcW w:type="dxa" w:w="1247"/>
-            <w:tcBorders>
-              <w:top w:val="single" w:color="000000" w:sz="4"/>
-              <w:left w:val="single" w:color="000000" w:sz="4"/>
-              <w:bottom w:val="single" w:color="000000" w:sz="4"/>
-              <w:right w:val="single" w:color="000000" w:sz="4"/>
-            </w:tcBorders>
-            <w:shd w:fill="ffffff" w:color="auto" w:val="clear"/>
-            <w:tcMar>
-              <w:top w:type="dxa" w:w="170"/>
-              <w:left w:type="dxa" w:w="170"/>
-              <w:bottom w:type="dxa" w:w="170"/>
-              <w:right w:type="dxa" w:w="170"/>
-            </w:tcMar>
-            <w:vAlign w:val="center"/>
-          </w:tcPr>
-          <w:p>
-            <w:pPr>
-              <w:jc w:val="left"/>
-            </w:pPr>
-            <w:r>
-              <w:rPr>
-                <w:rFonts w:ascii="NanumGothic" w:cs="NanumGothic" w:eastAsia="NanumGothic" w:hAnsi="NanumGothic"/>
-                <w:sz w:val="20"/>
-                <w:szCs w:val="20"/>
-              </w:rPr>
-              <w:t xml:space="preserve"/>
-            </w:r>
-          </w:p>
-        </w:tc>
-        <w:tc>
-          <w:tcPr>
-            <w:tcW w:type="dxa" w:w="907"/>
             <w:tcBorders>
               <w:top w:val="single" w:color="000000" w:sz="4"/>
               <w:left w:val="single" w:color="000000" w:sz="4"/>
@@ -1483,7 +1483,7 @@
         </w:tc>
         <w:tc>
           <w:tcPr>
-            <w:tcW w:type="dxa" w:w="3401"/>
+            <w:tcW w:type="dxa" w:w="3061"/>
             <w:tcBorders>
               <w:top w:val="single" w:color="000000" w:sz="4"/>
               <w:left w:val="single" w:color="000000" w:sz="4"/>
@@ -1515,7 +1515,7 @@
         </w:tc>
         <w:tc>
           <w:tcPr>
-            <w:tcW w:type="dxa" w:w="2267"/>
+            <w:tcW w:type="dxa" w:w="2040"/>
             <w:tcBorders>
               <w:top w:val="single" w:color="000000" w:sz="4"/>
               <w:left w:val="single" w:color="000000" w:sz="4"/>
@@ -1547,6 +1547,38 @@
         </w:tc>
         <w:tc>
           <w:tcPr>
+            <w:tcW w:type="dxa" w:w="1474"/>
+            <w:tcBorders>
+              <w:top w:val="single" w:color="000000" w:sz="4"/>
+              <w:left w:val="single" w:color="000000" w:sz="4"/>
+              <w:bottom w:val="single" w:color="000000" w:sz="4"/>
+              <w:right w:val="single" w:color="000000" w:sz="4"/>
+            </w:tcBorders>
+            <w:shd w:fill="F5F5F5" w:color="auto" w:val="clear"/>
+            <w:tcMar>
+              <w:top w:type="dxa" w:w="170"/>
+              <w:left w:type="dxa" w:w="170"/>
+              <w:bottom w:type="dxa" w:w="170"/>
+              <w:right w:type="dxa" w:w="170"/>
+            </w:tcMar>
+            <w:vAlign w:val="center"/>
+          </w:tcPr>
+          <w:p>
+            <w:pPr>
+              <w:jc w:val="left"/>
+            </w:pPr>
+            <w:r>
+              <w:rPr>
+                <w:rFonts w:ascii="NanumGothic" w:cs="NanumGothic" w:eastAsia="NanumGothic" w:hAnsi="NanumGothic"/>
+                <w:sz w:val="20"/>
+                <w:szCs w:val="20"/>
+              </w:rPr>
+              <w:t xml:space="preserve"/>
+            </w:r>
+          </w:p>
+        </w:tc>
+        <w:tc>
+          <w:tcPr>
             <w:tcW w:type="dxa" w:w="1247"/>
             <w:tcBorders>
               <w:top w:val="single" w:color="000000" w:sz="4"/>
@@ -1580,38 +1612,6 @@
         <w:tc>
           <w:tcPr>
             <w:tcW w:type="dxa" w:w="1247"/>
-            <w:tcBorders>
-              <w:top w:val="single" w:color="000000" w:sz="4"/>
-              <w:left w:val="single" w:color="000000" w:sz="4"/>
-              <w:bottom w:val="single" w:color="000000" w:sz="4"/>
-              <w:right w:val="single" w:color="000000" w:sz="4"/>
-            </w:tcBorders>
-            <w:shd w:fill="F5F5F5" w:color="auto" w:val="clear"/>
-            <w:tcMar>
-              <w:top w:type="dxa" w:w="170"/>
-              <w:left w:type="dxa" w:w="170"/>
-              <w:bottom w:type="dxa" w:w="170"/>
-              <w:right w:type="dxa" w:w="170"/>
-            </w:tcMar>
-            <w:vAlign w:val="center"/>
-          </w:tcPr>
-          <w:p>
-            <w:pPr>
-              <w:jc w:val="left"/>
-            </w:pPr>
-            <w:r>
-              <w:rPr>
-                <w:rFonts w:ascii="NanumGothic" w:cs="NanumGothic" w:eastAsia="NanumGothic" w:hAnsi="NanumGothic"/>
-                <w:sz w:val="20"/>
-                <w:szCs w:val="20"/>
-              </w:rPr>
-              <w:t xml:space="preserve"/>
-            </w:r>
-          </w:p>
-        </w:tc>
-        <w:tc>
-          <w:tcPr>
-            <w:tcW w:type="dxa" w:w="907"/>
             <w:tcBorders>
               <w:top w:val="single" w:color="000000" w:sz="4"/>
               <w:left w:val="single" w:color="000000" w:sz="4"/>
@@ -1680,39 +1680,71 @@
         </w:tc>
         <w:tc>
           <w:tcPr>
-            <w:tcW w:type="dxa" w:w="3401"/>
-            <w:tcBorders>
-              <w:top w:val="single" w:color="000000" w:sz="4"/>
-              <w:left w:val="single" w:color="000000" w:sz="4"/>
-              <w:bottom w:val="single" w:color="000000" w:sz="4"/>
-              <w:right w:val="single" w:color="000000" w:sz="4"/>
-            </w:tcBorders>
-            <w:shd w:fill="ffffff" w:color="auto" w:val="clear"/>
-            <w:tcMar>
-              <w:top w:type="dxa" w:w="170"/>
-              <w:left w:type="dxa" w:w="170"/>
-              <w:bottom w:type="dxa" w:w="170"/>
-              <w:right w:type="dxa" w:w="170"/>
-            </w:tcMar>
-            <w:vAlign w:val="center"/>
-          </w:tcPr>
-          <w:p>
-            <w:pPr>
-              <w:jc w:val="left"/>
-            </w:pPr>
-            <w:r>
-              <w:rPr>
-                <w:rFonts w:ascii="NanumGothic" w:cs="NanumGothic" w:eastAsia="NanumGothic" w:hAnsi="NanumGothic"/>
-                <w:sz w:val="20"/>
-                <w:szCs w:val="20"/>
-              </w:rPr>
-              <w:t xml:space="preserve"/>
-            </w:r>
-          </w:p>
-        </w:tc>
-        <w:tc>
-          <w:tcPr>
-            <w:tcW w:type="dxa" w:w="2267"/>
+            <w:tcW w:type="dxa" w:w="3061"/>
+            <w:tcBorders>
+              <w:top w:val="single" w:color="000000" w:sz="4"/>
+              <w:left w:val="single" w:color="000000" w:sz="4"/>
+              <w:bottom w:val="single" w:color="000000" w:sz="4"/>
+              <w:right w:val="single" w:color="000000" w:sz="4"/>
+            </w:tcBorders>
+            <w:shd w:fill="ffffff" w:color="auto" w:val="clear"/>
+            <w:tcMar>
+              <w:top w:type="dxa" w:w="170"/>
+              <w:left w:type="dxa" w:w="170"/>
+              <w:bottom w:type="dxa" w:w="170"/>
+              <w:right w:type="dxa" w:w="170"/>
+            </w:tcMar>
+            <w:vAlign w:val="center"/>
+          </w:tcPr>
+          <w:p>
+            <w:pPr>
+              <w:jc w:val="left"/>
+            </w:pPr>
+            <w:r>
+              <w:rPr>
+                <w:rFonts w:ascii="NanumGothic" w:cs="NanumGothic" w:eastAsia="NanumGothic" w:hAnsi="NanumGothic"/>
+                <w:sz w:val="20"/>
+                <w:szCs w:val="20"/>
+              </w:rPr>
+              <w:t xml:space="preserve"/>
+            </w:r>
+          </w:p>
+        </w:tc>
+        <w:tc>
+          <w:tcPr>
+            <w:tcW w:type="dxa" w:w="2040"/>
+            <w:tcBorders>
+              <w:top w:val="single" w:color="000000" w:sz="4"/>
+              <w:left w:val="single" w:color="000000" w:sz="4"/>
+              <w:bottom w:val="single" w:color="000000" w:sz="4"/>
+              <w:right w:val="single" w:color="000000" w:sz="4"/>
+            </w:tcBorders>
+            <w:shd w:fill="ffffff" w:color="auto" w:val="clear"/>
+            <w:tcMar>
+              <w:top w:type="dxa" w:w="170"/>
+              <w:left w:type="dxa" w:w="170"/>
+              <w:bottom w:type="dxa" w:w="170"/>
+              <w:right w:type="dxa" w:w="170"/>
+            </w:tcMar>
+            <w:vAlign w:val="center"/>
+          </w:tcPr>
+          <w:p>
+            <w:pPr>
+              <w:jc w:val="left"/>
+            </w:pPr>
+            <w:r>
+              <w:rPr>
+                <w:rFonts w:ascii="NanumGothic" w:cs="NanumGothic" w:eastAsia="NanumGothic" w:hAnsi="NanumGothic"/>
+                <w:sz w:val="20"/>
+                <w:szCs w:val="20"/>
+              </w:rPr>
+              <w:t xml:space="preserve"/>
+            </w:r>
+          </w:p>
+        </w:tc>
+        <w:tc>
+          <w:tcPr>
+            <w:tcW w:type="dxa" w:w="1474"/>
             <w:tcBorders>
               <w:top w:val="single" w:color="000000" w:sz="4"/>
               <w:left w:val="single" w:color="000000" w:sz="4"/>
@@ -1777,38 +1809,6 @@
         <w:tc>
           <w:tcPr>
             <w:tcW w:type="dxa" w:w="1247"/>
-            <w:tcBorders>
-              <w:top w:val="single" w:color="000000" w:sz="4"/>
-              <w:left w:val="single" w:color="000000" w:sz="4"/>
-              <w:bottom w:val="single" w:color="000000" w:sz="4"/>
-              <w:right w:val="single" w:color="000000" w:sz="4"/>
-            </w:tcBorders>
-            <w:shd w:fill="ffffff" w:color="auto" w:val="clear"/>
-            <w:tcMar>
-              <w:top w:type="dxa" w:w="170"/>
-              <w:left w:type="dxa" w:w="170"/>
-              <w:bottom w:type="dxa" w:w="170"/>
-              <w:right w:type="dxa" w:w="170"/>
-            </w:tcMar>
-            <w:vAlign w:val="center"/>
-          </w:tcPr>
-          <w:p>
-            <w:pPr>
-              <w:jc w:val="left"/>
-            </w:pPr>
-            <w:r>
-              <w:rPr>
-                <w:rFonts w:ascii="NanumGothic" w:cs="NanumGothic" w:eastAsia="NanumGothic" w:hAnsi="NanumGothic"/>
-                <w:sz w:val="20"/>
-                <w:szCs w:val="20"/>
-              </w:rPr>
-              <w:t xml:space="preserve"/>
-            </w:r>
-          </w:p>
-        </w:tc>
-        <w:tc>
-          <w:tcPr>
-            <w:tcW w:type="dxa" w:w="907"/>
             <w:tcBorders>
               <w:top w:val="single" w:color="000000" w:sz="4"/>
               <w:left w:val="single" w:color="000000" w:sz="4"/>
@@ -1877,7 +1877,7 @@
         </w:tc>
         <w:tc>
           <w:tcPr>
-            <w:tcW w:type="dxa" w:w="3401"/>
+            <w:tcW w:type="dxa" w:w="3061"/>
             <w:tcBorders>
               <w:top w:val="single" w:color="000000" w:sz="4"/>
               <w:left w:val="single" w:color="000000" w:sz="4"/>
@@ -1909,7 +1909,7 @@
         </w:tc>
         <w:tc>
           <w:tcPr>
-            <w:tcW w:type="dxa" w:w="2267"/>
+            <w:tcW w:type="dxa" w:w="2040"/>
             <w:tcBorders>
               <w:top w:val="single" w:color="000000" w:sz="4"/>
               <w:left w:val="single" w:color="000000" w:sz="4"/>
@@ -1941,6 +1941,38 @@
         </w:tc>
         <w:tc>
           <w:tcPr>
+            <w:tcW w:type="dxa" w:w="1474"/>
+            <w:tcBorders>
+              <w:top w:val="single" w:color="000000" w:sz="4"/>
+              <w:left w:val="single" w:color="000000" w:sz="4"/>
+              <w:bottom w:val="single" w:color="000000" w:sz="4"/>
+              <w:right w:val="single" w:color="000000" w:sz="4"/>
+            </w:tcBorders>
+            <w:shd w:fill="F5F5F5" w:color="auto" w:val="clear"/>
+            <w:tcMar>
+              <w:top w:type="dxa" w:w="170"/>
+              <w:left w:type="dxa" w:w="170"/>
+              <w:bottom w:type="dxa" w:w="170"/>
+              <w:right w:type="dxa" w:w="170"/>
+            </w:tcMar>
+            <w:vAlign w:val="center"/>
+          </w:tcPr>
+          <w:p>
+            <w:pPr>
+              <w:jc w:val="left"/>
+            </w:pPr>
+            <w:r>
+              <w:rPr>
+                <w:rFonts w:ascii="NanumGothic" w:cs="NanumGothic" w:eastAsia="NanumGothic" w:hAnsi="NanumGothic"/>
+                <w:sz w:val="20"/>
+                <w:szCs w:val="20"/>
+              </w:rPr>
+              <w:t xml:space="preserve"/>
+            </w:r>
+          </w:p>
+        </w:tc>
+        <w:tc>
+          <w:tcPr>
             <w:tcW w:type="dxa" w:w="1247"/>
             <w:tcBorders>
               <w:top w:val="single" w:color="000000" w:sz="4"/>
@@ -1974,38 +2006,6 @@
         <w:tc>
           <w:tcPr>
             <w:tcW w:type="dxa" w:w="1247"/>
-            <w:tcBorders>
-              <w:top w:val="single" w:color="000000" w:sz="4"/>
-              <w:left w:val="single" w:color="000000" w:sz="4"/>
-              <w:bottom w:val="single" w:color="000000" w:sz="4"/>
-              <w:right w:val="single" w:color="000000" w:sz="4"/>
-            </w:tcBorders>
-            <w:shd w:fill="F5F5F5" w:color="auto" w:val="clear"/>
-            <w:tcMar>
-              <w:top w:type="dxa" w:w="170"/>
-              <w:left w:type="dxa" w:w="170"/>
-              <w:bottom w:type="dxa" w:w="170"/>
-              <w:right w:type="dxa" w:w="170"/>
-            </w:tcMar>
-            <w:vAlign w:val="center"/>
-          </w:tcPr>
-          <w:p>
-            <w:pPr>
-              <w:jc w:val="left"/>
-            </w:pPr>
-            <w:r>
-              <w:rPr>
-                <w:rFonts w:ascii="NanumGothic" w:cs="NanumGothic" w:eastAsia="NanumGothic" w:hAnsi="NanumGothic"/>
-                <w:sz w:val="20"/>
-                <w:szCs w:val="20"/>
-              </w:rPr>
-              <w:t xml:space="preserve"/>
-            </w:r>
-          </w:p>
-        </w:tc>
-        <w:tc>
-          <w:tcPr>
-            <w:tcW w:type="dxa" w:w="907"/>
             <w:tcBorders>
               <w:top w:val="single" w:color="000000" w:sz="4"/>
               <w:left w:val="single" w:color="000000" w:sz="4"/>
@@ -2074,39 +2074,71 @@
         </w:tc>
         <w:tc>
           <w:tcPr>
-            <w:tcW w:type="dxa" w:w="3401"/>
-            <w:tcBorders>
-              <w:top w:val="single" w:color="000000" w:sz="4"/>
-              <w:left w:val="single" w:color="000000" w:sz="4"/>
-              <w:bottom w:val="single" w:color="000000" w:sz="4"/>
-              <w:right w:val="single" w:color="000000" w:sz="4"/>
-            </w:tcBorders>
-            <w:shd w:fill="ffffff" w:color="auto" w:val="clear"/>
-            <w:tcMar>
-              <w:top w:type="dxa" w:w="170"/>
-              <w:left w:type="dxa" w:w="170"/>
-              <w:bottom w:type="dxa" w:w="170"/>
-              <w:right w:type="dxa" w:w="170"/>
-            </w:tcMar>
-            <w:vAlign w:val="center"/>
-          </w:tcPr>
-          <w:p>
-            <w:pPr>
-              <w:jc w:val="left"/>
-            </w:pPr>
-            <w:r>
-              <w:rPr>
-                <w:rFonts w:ascii="NanumGothic" w:cs="NanumGothic" w:eastAsia="NanumGothic" w:hAnsi="NanumGothic"/>
-                <w:sz w:val="20"/>
-                <w:szCs w:val="20"/>
-              </w:rPr>
-              <w:t xml:space="preserve"/>
-            </w:r>
-          </w:p>
-        </w:tc>
-        <w:tc>
-          <w:tcPr>
-            <w:tcW w:type="dxa" w:w="2267"/>
+            <w:tcW w:type="dxa" w:w="3061"/>
+            <w:tcBorders>
+              <w:top w:val="single" w:color="000000" w:sz="4"/>
+              <w:left w:val="single" w:color="000000" w:sz="4"/>
+              <w:bottom w:val="single" w:color="000000" w:sz="4"/>
+              <w:right w:val="single" w:color="000000" w:sz="4"/>
+            </w:tcBorders>
+            <w:shd w:fill="ffffff" w:color="auto" w:val="clear"/>
+            <w:tcMar>
+              <w:top w:type="dxa" w:w="170"/>
+              <w:left w:type="dxa" w:w="170"/>
+              <w:bottom w:type="dxa" w:w="170"/>
+              <w:right w:type="dxa" w:w="170"/>
+            </w:tcMar>
+            <w:vAlign w:val="center"/>
+          </w:tcPr>
+          <w:p>
+            <w:pPr>
+              <w:jc w:val="left"/>
+            </w:pPr>
+            <w:r>
+              <w:rPr>
+                <w:rFonts w:ascii="NanumGothic" w:cs="NanumGothic" w:eastAsia="NanumGothic" w:hAnsi="NanumGothic"/>
+                <w:sz w:val="20"/>
+                <w:szCs w:val="20"/>
+              </w:rPr>
+              <w:t xml:space="preserve"/>
+            </w:r>
+          </w:p>
+        </w:tc>
+        <w:tc>
+          <w:tcPr>
+            <w:tcW w:type="dxa" w:w="2040"/>
+            <w:tcBorders>
+              <w:top w:val="single" w:color="000000" w:sz="4"/>
+              <w:left w:val="single" w:color="000000" w:sz="4"/>
+              <w:bottom w:val="single" w:color="000000" w:sz="4"/>
+              <w:right w:val="single" w:color="000000" w:sz="4"/>
+            </w:tcBorders>
+            <w:shd w:fill="ffffff" w:color="auto" w:val="clear"/>
+            <w:tcMar>
+              <w:top w:type="dxa" w:w="170"/>
+              <w:left w:type="dxa" w:w="170"/>
+              <w:bottom w:type="dxa" w:w="170"/>
+              <w:right w:type="dxa" w:w="170"/>
+            </w:tcMar>
+            <w:vAlign w:val="center"/>
+          </w:tcPr>
+          <w:p>
+            <w:pPr>
+              <w:jc w:val="left"/>
+            </w:pPr>
+            <w:r>
+              <w:rPr>
+                <w:rFonts w:ascii="NanumGothic" w:cs="NanumGothic" w:eastAsia="NanumGothic" w:hAnsi="NanumGothic"/>
+                <w:sz w:val="20"/>
+                <w:szCs w:val="20"/>
+              </w:rPr>
+              <w:t xml:space="preserve"/>
+            </w:r>
+          </w:p>
+        </w:tc>
+        <w:tc>
+          <w:tcPr>
+            <w:tcW w:type="dxa" w:w="1474"/>
             <w:tcBorders>
               <w:top w:val="single" w:color="000000" w:sz="4"/>
               <w:left w:val="single" w:color="000000" w:sz="4"/>
@@ -2171,38 +2203,6 @@
         <w:tc>
           <w:tcPr>
             <w:tcW w:type="dxa" w:w="1247"/>
-            <w:tcBorders>
-              <w:top w:val="single" w:color="000000" w:sz="4"/>
-              <w:left w:val="single" w:color="000000" w:sz="4"/>
-              <w:bottom w:val="single" w:color="000000" w:sz="4"/>
-              <w:right w:val="single" w:color="000000" w:sz="4"/>
-            </w:tcBorders>
-            <w:shd w:fill="ffffff" w:color="auto" w:val="clear"/>
-            <w:tcMar>
-              <w:top w:type="dxa" w:w="170"/>
-              <w:left w:type="dxa" w:w="170"/>
-              <w:bottom w:type="dxa" w:w="170"/>
-              <w:right w:type="dxa" w:w="170"/>
-            </w:tcMar>
-            <w:vAlign w:val="center"/>
-          </w:tcPr>
-          <w:p>
-            <w:pPr>
-              <w:jc w:val="left"/>
-            </w:pPr>
-            <w:r>
-              <w:rPr>
-                <w:rFonts w:ascii="NanumGothic" w:cs="NanumGothic" w:eastAsia="NanumGothic" w:hAnsi="NanumGothic"/>
-                <w:sz w:val="20"/>
-                <w:szCs w:val="20"/>
-              </w:rPr>
-              <w:t xml:space="preserve"/>
-            </w:r>
-          </w:p>
-        </w:tc>
-        <w:tc>
-          <w:tcPr>
-            <w:tcW w:type="dxa" w:w="907"/>
             <w:tcBorders>
               <w:top w:val="single" w:color="000000" w:sz="4"/>
               <w:left w:val="single" w:color="000000" w:sz="4"/>
@@ -2271,7 +2271,7 @@
         </w:tc>
         <w:tc>
           <w:tcPr>
-            <w:tcW w:type="dxa" w:w="3401"/>
+            <w:tcW w:type="dxa" w:w="3061"/>
             <w:tcBorders>
               <w:top w:val="single" w:color="000000" w:sz="4"/>
               <w:left w:val="single" w:color="000000" w:sz="4"/>
@@ -2303,7 +2303,7 @@
         </w:tc>
         <w:tc>
           <w:tcPr>
-            <w:tcW w:type="dxa" w:w="2267"/>
+            <w:tcW w:type="dxa" w:w="2040"/>
             <w:tcBorders>
               <w:top w:val="single" w:color="000000" w:sz="4"/>
               <w:left w:val="single" w:color="000000" w:sz="4"/>
@@ -2335,6 +2335,38 @@
         </w:tc>
         <w:tc>
           <w:tcPr>
+            <w:tcW w:type="dxa" w:w="1474"/>
+            <w:tcBorders>
+              <w:top w:val="single" w:color="000000" w:sz="4"/>
+              <w:left w:val="single" w:color="000000" w:sz="4"/>
+              <w:bottom w:val="single" w:color="000000" w:sz="4"/>
+              <w:right w:val="single" w:color="000000" w:sz="4"/>
+            </w:tcBorders>
+            <w:shd w:fill="F5F5F5" w:color="auto" w:val="clear"/>
+            <w:tcMar>
+              <w:top w:type="dxa" w:w="170"/>
+              <w:left w:type="dxa" w:w="170"/>
+              <w:bottom w:type="dxa" w:w="170"/>
+              <w:right w:type="dxa" w:w="170"/>
+            </w:tcMar>
+            <w:vAlign w:val="center"/>
+          </w:tcPr>
+          <w:p>
+            <w:pPr>
+              <w:jc w:val="left"/>
+            </w:pPr>
+            <w:r>
+              <w:rPr>
+                <w:rFonts w:ascii="NanumGothic" w:cs="NanumGothic" w:eastAsia="NanumGothic" w:hAnsi="NanumGothic"/>
+                <w:sz w:val="20"/>
+                <w:szCs w:val="20"/>
+              </w:rPr>
+              <w:t xml:space="preserve"/>
+            </w:r>
+          </w:p>
+        </w:tc>
+        <w:tc>
+          <w:tcPr>
             <w:tcW w:type="dxa" w:w="1247"/>
             <w:tcBorders>
               <w:top w:val="single" w:color="000000" w:sz="4"/>
@@ -2368,38 +2400,6 @@
         <w:tc>
           <w:tcPr>
             <w:tcW w:type="dxa" w:w="1247"/>
-            <w:tcBorders>
-              <w:top w:val="single" w:color="000000" w:sz="4"/>
-              <w:left w:val="single" w:color="000000" w:sz="4"/>
-              <w:bottom w:val="single" w:color="000000" w:sz="4"/>
-              <w:right w:val="single" w:color="000000" w:sz="4"/>
-            </w:tcBorders>
-            <w:shd w:fill="F5F5F5" w:color="auto" w:val="clear"/>
-            <w:tcMar>
-              <w:top w:type="dxa" w:w="170"/>
-              <w:left w:type="dxa" w:w="170"/>
-              <w:bottom w:type="dxa" w:w="170"/>
-              <w:right w:type="dxa" w:w="170"/>
-            </w:tcMar>
-            <w:vAlign w:val="center"/>
-          </w:tcPr>
-          <w:p>
-            <w:pPr>
-              <w:jc w:val="left"/>
-            </w:pPr>
-            <w:r>
-              <w:rPr>
-                <w:rFonts w:ascii="NanumGothic" w:cs="NanumGothic" w:eastAsia="NanumGothic" w:hAnsi="NanumGothic"/>
-                <w:sz w:val="20"/>
-                <w:szCs w:val="20"/>
-              </w:rPr>
-              <w:t xml:space="preserve"/>
-            </w:r>
-          </w:p>
-        </w:tc>
-        <w:tc>
-          <w:tcPr>
-            <w:tcW w:type="dxa" w:w="907"/>
             <w:tcBorders>
               <w:top w:val="single" w:color="000000" w:sz="4"/>
               <w:left w:val="single" w:color="000000" w:sz="4"/>
@@ -2468,39 +2468,71 @@
         </w:tc>
         <w:tc>
           <w:tcPr>
-            <w:tcW w:type="dxa" w:w="3401"/>
-            <w:tcBorders>
-              <w:top w:val="single" w:color="000000" w:sz="4"/>
-              <w:left w:val="single" w:color="000000" w:sz="4"/>
-              <w:bottom w:val="single" w:color="000000" w:sz="4"/>
-              <w:right w:val="single" w:color="000000" w:sz="4"/>
-            </w:tcBorders>
-            <w:shd w:fill="ffffff" w:color="auto" w:val="clear"/>
-            <w:tcMar>
-              <w:top w:type="dxa" w:w="170"/>
-              <w:left w:type="dxa" w:w="170"/>
-              <w:bottom w:type="dxa" w:w="170"/>
-              <w:right w:type="dxa" w:w="170"/>
-            </w:tcMar>
-            <w:vAlign w:val="center"/>
-          </w:tcPr>
-          <w:p>
-            <w:pPr>
-              <w:jc w:val="left"/>
-            </w:pPr>
-            <w:r>
-              <w:rPr>
-                <w:rFonts w:ascii="NanumGothic" w:cs="NanumGothic" w:eastAsia="NanumGothic" w:hAnsi="NanumGothic"/>
-                <w:sz w:val="20"/>
-                <w:szCs w:val="20"/>
-              </w:rPr>
-              <w:t xml:space="preserve"/>
-            </w:r>
-          </w:p>
-        </w:tc>
-        <w:tc>
-          <w:tcPr>
-            <w:tcW w:type="dxa" w:w="2267"/>
+            <w:tcW w:type="dxa" w:w="3061"/>
+            <w:tcBorders>
+              <w:top w:val="single" w:color="000000" w:sz="4"/>
+              <w:left w:val="single" w:color="000000" w:sz="4"/>
+              <w:bottom w:val="single" w:color="000000" w:sz="4"/>
+              <w:right w:val="single" w:color="000000" w:sz="4"/>
+            </w:tcBorders>
+            <w:shd w:fill="ffffff" w:color="auto" w:val="clear"/>
+            <w:tcMar>
+              <w:top w:type="dxa" w:w="170"/>
+              <w:left w:type="dxa" w:w="170"/>
+              <w:bottom w:type="dxa" w:w="170"/>
+              <w:right w:type="dxa" w:w="170"/>
+            </w:tcMar>
+            <w:vAlign w:val="center"/>
+          </w:tcPr>
+          <w:p>
+            <w:pPr>
+              <w:jc w:val="left"/>
+            </w:pPr>
+            <w:r>
+              <w:rPr>
+                <w:rFonts w:ascii="NanumGothic" w:cs="NanumGothic" w:eastAsia="NanumGothic" w:hAnsi="NanumGothic"/>
+                <w:sz w:val="20"/>
+                <w:szCs w:val="20"/>
+              </w:rPr>
+              <w:t xml:space="preserve"/>
+            </w:r>
+          </w:p>
+        </w:tc>
+        <w:tc>
+          <w:tcPr>
+            <w:tcW w:type="dxa" w:w="2040"/>
+            <w:tcBorders>
+              <w:top w:val="single" w:color="000000" w:sz="4"/>
+              <w:left w:val="single" w:color="000000" w:sz="4"/>
+              <w:bottom w:val="single" w:color="000000" w:sz="4"/>
+              <w:right w:val="single" w:color="000000" w:sz="4"/>
+            </w:tcBorders>
+            <w:shd w:fill="ffffff" w:color="auto" w:val="clear"/>
+            <w:tcMar>
+              <w:top w:type="dxa" w:w="170"/>
+              <w:left w:type="dxa" w:w="170"/>
+              <w:bottom w:type="dxa" w:w="170"/>
+              <w:right w:type="dxa" w:w="170"/>
+            </w:tcMar>
+            <w:vAlign w:val="center"/>
+          </w:tcPr>
+          <w:p>
+            <w:pPr>
+              <w:jc w:val="left"/>
+            </w:pPr>
+            <w:r>
+              <w:rPr>
+                <w:rFonts w:ascii="NanumGothic" w:cs="NanumGothic" w:eastAsia="NanumGothic" w:hAnsi="NanumGothic"/>
+                <w:sz w:val="20"/>
+                <w:szCs w:val="20"/>
+              </w:rPr>
+              <w:t xml:space="preserve"/>
+            </w:r>
+          </w:p>
+        </w:tc>
+        <w:tc>
+          <w:tcPr>
+            <w:tcW w:type="dxa" w:w="1474"/>
             <w:tcBorders>
               <w:top w:val="single" w:color="000000" w:sz="4"/>
               <w:left w:val="single" w:color="000000" w:sz="4"/>
@@ -2565,38 +2597,6 @@
         <w:tc>
           <w:tcPr>
             <w:tcW w:type="dxa" w:w="1247"/>
-            <w:tcBorders>
-              <w:top w:val="single" w:color="000000" w:sz="4"/>
-              <w:left w:val="single" w:color="000000" w:sz="4"/>
-              <w:bottom w:val="single" w:color="000000" w:sz="4"/>
-              <w:right w:val="single" w:color="000000" w:sz="4"/>
-            </w:tcBorders>
-            <w:shd w:fill="ffffff" w:color="auto" w:val="clear"/>
-            <w:tcMar>
-              <w:top w:type="dxa" w:w="170"/>
-              <w:left w:type="dxa" w:w="170"/>
-              <w:bottom w:type="dxa" w:w="170"/>
-              <w:right w:type="dxa" w:w="170"/>
-            </w:tcMar>
-            <w:vAlign w:val="center"/>
-          </w:tcPr>
-          <w:p>
-            <w:pPr>
-              <w:jc w:val="left"/>
-            </w:pPr>
-            <w:r>
-              <w:rPr>
-                <w:rFonts w:ascii="NanumGothic" w:cs="NanumGothic" w:eastAsia="NanumGothic" w:hAnsi="NanumGothic"/>
-                <w:sz w:val="20"/>
-                <w:szCs w:val="20"/>
-              </w:rPr>
-              <w:t xml:space="preserve"/>
-            </w:r>
-          </w:p>
-        </w:tc>
-        <w:tc>
-          <w:tcPr>
-            <w:tcW w:type="dxa" w:w="907"/>
             <w:tcBorders>
               <w:top w:val="single" w:color="000000" w:sz="4"/>
               <w:left w:val="single" w:color="000000" w:sz="4"/>
@@ -2665,7 +2665,7 @@
         </w:tc>
         <w:tc>
           <w:tcPr>
-            <w:tcW w:type="dxa" w:w="3401"/>
+            <w:tcW w:type="dxa" w:w="3061"/>
             <w:tcBorders>
               <w:top w:val="single" w:color="000000" w:sz="4"/>
               <w:left w:val="single" w:color="000000" w:sz="4"/>
@@ -2697,7 +2697,7 @@
         </w:tc>
         <w:tc>
           <w:tcPr>
-            <w:tcW w:type="dxa" w:w="2267"/>
+            <w:tcW w:type="dxa" w:w="2040"/>
             <w:tcBorders>
               <w:top w:val="single" w:color="000000" w:sz="4"/>
               <w:left w:val="single" w:color="000000" w:sz="4"/>
@@ -2729,6 +2729,38 @@
         </w:tc>
         <w:tc>
           <w:tcPr>
+            <w:tcW w:type="dxa" w:w="1474"/>
+            <w:tcBorders>
+              <w:top w:val="single" w:color="000000" w:sz="4"/>
+              <w:left w:val="single" w:color="000000" w:sz="4"/>
+              <w:bottom w:val="single" w:color="000000" w:sz="4"/>
+              <w:right w:val="single" w:color="000000" w:sz="4"/>
+            </w:tcBorders>
+            <w:shd w:fill="F5F5F5" w:color="auto" w:val="clear"/>
+            <w:tcMar>
+              <w:top w:type="dxa" w:w="170"/>
+              <w:left w:type="dxa" w:w="170"/>
+              <w:bottom w:type="dxa" w:w="170"/>
+              <w:right w:type="dxa" w:w="170"/>
+            </w:tcMar>
+            <w:vAlign w:val="center"/>
+          </w:tcPr>
+          <w:p>
+            <w:pPr>
+              <w:jc w:val="left"/>
+            </w:pPr>
+            <w:r>
+              <w:rPr>
+                <w:rFonts w:ascii="NanumGothic" w:cs="NanumGothic" w:eastAsia="NanumGothic" w:hAnsi="NanumGothic"/>
+                <w:sz w:val="20"/>
+                <w:szCs w:val="20"/>
+              </w:rPr>
+              <w:t xml:space="preserve"/>
+            </w:r>
+          </w:p>
+        </w:tc>
+        <w:tc>
+          <w:tcPr>
             <w:tcW w:type="dxa" w:w="1247"/>
             <w:tcBorders>
               <w:top w:val="single" w:color="000000" w:sz="4"/>
@@ -2762,38 +2794,6 @@
         <w:tc>
           <w:tcPr>
             <w:tcW w:type="dxa" w:w="1247"/>
-            <w:tcBorders>
-              <w:top w:val="single" w:color="000000" w:sz="4"/>
-              <w:left w:val="single" w:color="000000" w:sz="4"/>
-              <w:bottom w:val="single" w:color="000000" w:sz="4"/>
-              <w:right w:val="single" w:color="000000" w:sz="4"/>
-            </w:tcBorders>
-            <w:shd w:fill="F5F5F5" w:color="auto" w:val="clear"/>
-            <w:tcMar>
-              <w:top w:type="dxa" w:w="170"/>
-              <w:left w:type="dxa" w:w="170"/>
-              <w:bottom w:type="dxa" w:w="170"/>
-              <w:right w:type="dxa" w:w="170"/>
-            </w:tcMar>
-            <w:vAlign w:val="center"/>
-          </w:tcPr>
-          <w:p>
-            <w:pPr>
-              <w:jc w:val="left"/>
-            </w:pPr>
-            <w:r>
-              <w:rPr>
-                <w:rFonts w:ascii="NanumGothic" w:cs="NanumGothic" w:eastAsia="NanumGothic" w:hAnsi="NanumGothic"/>
-                <w:sz w:val="20"/>
-                <w:szCs w:val="20"/>
-              </w:rPr>
-              <w:t xml:space="preserve"/>
-            </w:r>
-          </w:p>
-        </w:tc>
-        <w:tc>
-          <w:tcPr>
-            <w:tcW w:type="dxa" w:w="907"/>
             <w:tcBorders>
               <w:top w:val="single" w:color="000000" w:sz="4"/>
               <w:left w:val="single" w:color="000000" w:sz="4"/>
@@ -2862,39 +2862,71 @@
         </w:tc>
         <w:tc>
           <w:tcPr>
-            <w:tcW w:type="dxa" w:w="3401"/>
-            <w:tcBorders>
-              <w:top w:val="single" w:color="000000" w:sz="4"/>
-              <w:left w:val="single" w:color="000000" w:sz="4"/>
-              <w:bottom w:val="single" w:color="000000" w:sz="4"/>
-              <w:right w:val="single" w:color="000000" w:sz="4"/>
-            </w:tcBorders>
-            <w:shd w:fill="ffffff" w:color="auto" w:val="clear"/>
-            <w:tcMar>
-              <w:top w:type="dxa" w:w="170"/>
-              <w:left w:type="dxa" w:w="170"/>
-              <w:bottom w:type="dxa" w:w="170"/>
-              <w:right w:type="dxa" w:w="170"/>
-            </w:tcMar>
-            <w:vAlign w:val="center"/>
-          </w:tcPr>
-          <w:p>
-            <w:pPr>
-              <w:jc w:val="left"/>
-            </w:pPr>
-            <w:r>
-              <w:rPr>
-                <w:rFonts w:ascii="NanumGothic" w:cs="NanumGothic" w:eastAsia="NanumGothic" w:hAnsi="NanumGothic"/>
-                <w:sz w:val="20"/>
-                <w:szCs w:val="20"/>
-              </w:rPr>
-              <w:t xml:space="preserve"/>
-            </w:r>
-          </w:p>
-        </w:tc>
-        <w:tc>
-          <w:tcPr>
-            <w:tcW w:type="dxa" w:w="2267"/>
+            <w:tcW w:type="dxa" w:w="3061"/>
+            <w:tcBorders>
+              <w:top w:val="single" w:color="000000" w:sz="4"/>
+              <w:left w:val="single" w:color="000000" w:sz="4"/>
+              <w:bottom w:val="single" w:color="000000" w:sz="4"/>
+              <w:right w:val="single" w:color="000000" w:sz="4"/>
+            </w:tcBorders>
+            <w:shd w:fill="ffffff" w:color="auto" w:val="clear"/>
+            <w:tcMar>
+              <w:top w:type="dxa" w:w="170"/>
+              <w:left w:type="dxa" w:w="170"/>
+              <w:bottom w:type="dxa" w:w="170"/>
+              <w:right w:type="dxa" w:w="170"/>
+            </w:tcMar>
+            <w:vAlign w:val="center"/>
+          </w:tcPr>
+          <w:p>
+            <w:pPr>
+              <w:jc w:val="left"/>
+            </w:pPr>
+            <w:r>
+              <w:rPr>
+                <w:rFonts w:ascii="NanumGothic" w:cs="NanumGothic" w:eastAsia="NanumGothic" w:hAnsi="NanumGothic"/>
+                <w:sz w:val="20"/>
+                <w:szCs w:val="20"/>
+              </w:rPr>
+              <w:t xml:space="preserve"/>
+            </w:r>
+          </w:p>
+        </w:tc>
+        <w:tc>
+          <w:tcPr>
+            <w:tcW w:type="dxa" w:w="2040"/>
+            <w:tcBorders>
+              <w:top w:val="single" w:color="000000" w:sz="4"/>
+              <w:left w:val="single" w:color="000000" w:sz="4"/>
+              <w:bottom w:val="single" w:color="000000" w:sz="4"/>
+              <w:right w:val="single" w:color="000000" w:sz="4"/>
+            </w:tcBorders>
+            <w:shd w:fill="ffffff" w:color="auto" w:val="clear"/>
+            <w:tcMar>
+              <w:top w:type="dxa" w:w="170"/>
+              <w:left w:type="dxa" w:w="170"/>
+              <w:bottom w:type="dxa" w:w="170"/>
+              <w:right w:type="dxa" w:w="170"/>
+            </w:tcMar>
+            <w:vAlign w:val="center"/>
+          </w:tcPr>
+          <w:p>
+            <w:pPr>
+              <w:jc w:val="left"/>
+            </w:pPr>
+            <w:r>
+              <w:rPr>
+                <w:rFonts w:ascii="NanumGothic" w:cs="NanumGothic" w:eastAsia="NanumGothic" w:hAnsi="NanumGothic"/>
+                <w:sz w:val="20"/>
+                <w:szCs w:val="20"/>
+              </w:rPr>
+              <w:t xml:space="preserve"/>
+            </w:r>
+          </w:p>
+        </w:tc>
+        <w:tc>
+          <w:tcPr>
+            <w:tcW w:type="dxa" w:w="1474"/>
             <w:tcBorders>
               <w:top w:val="single" w:color="000000" w:sz="4"/>
               <w:left w:val="single" w:color="000000" w:sz="4"/>
@@ -2959,38 +2991,6 @@
         <w:tc>
           <w:tcPr>
             <w:tcW w:type="dxa" w:w="1247"/>
-            <w:tcBorders>
-              <w:top w:val="single" w:color="000000" w:sz="4"/>
-              <w:left w:val="single" w:color="000000" w:sz="4"/>
-              <w:bottom w:val="single" w:color="000000" w:sz="4"/>
-              <w:right w:val="single" w:color="000000" w:sz="4"/>
-            </w:tcBorders>
-            <w:shd w:fill="ffffff" w:color="auto" w:val="clear"/>
-            <w:tcMar>
-              <w:top w:type="dxa" w:w="170"/>
-              <w:left w:type="dxa" w:w="170"/>
-              <w:bottom w:type="dxa" w:w="170"/>
-              <w:right w:type="dxa" w:w="170"/>
-            </w:tcMar>
-            <w:vAlign w:val="center"/>
-          </w:tcPr>
-          <w:p>
-            <w:pPr>
-              <w:jc w:val="left"/>
-            </w:pPr>
-            <w:r>
-              <w:rPr>
-                <w:rFonts w:ascii="NanumGothic" w:cs="NanumGothic" w:eastAsia="NanumGothic" w:hAnsi="NanumGothic"/>
-                <w:sz w:val="20"/>
-                <w:szCs w:val="20"/>
-              </w:rPr>
-              <w:t xml:space="preserve"/>
-            </w:r>
-          </w:p>
-        </w:tc>
-        <w:tc>
-          <w:tcPr>
-            <w:tcW w:type="dxa" w:w="907"/>
             <w:tcBorders>
               <w:top w:val="single" w:color="000000" w:sz="4"/>
               <w:left w:val="single" w:color="000000" w:sz="4"/>
@@ -3059,7 +3059,7 @@
         </w:tc>
         <w:tc>
           <w:tcPr>
-            <w:tcW w:type="dxa" w:w="3401"/>
+            <w:tcW w:type="dxa" w:w="3061"/>
             <w:tcBorders>
               <w:top w:val="single" w:color="000000" w:sz="4"/>
               <w:left w:val="single" w:color="000000" w:sz="4"/>
@@ -3091,7 +3091,7 @@
         </w:tc>
         <w:tc>
           <w:tcPr>
-            <w:tcW w:type="dxa" w:w="2267"/>
+            <w:tcW w:type="dxa" w:w="2040"/>
             <w:tcBorders>
               <w:top w:val="single" w:color="000000" w:sz="4"/>
               <w:left w:val="single" w:color="000000" w:sz="4"/>
@@ -3123,6 +3123,38 @@
         </w:tc>
         <w:tc>
           <w:tcPr>
+            <w:tcW w:type="dxa" w:w="1474"/>
+            <w:tcBorders>
+              <w:top w:val="single" w:color="000000" w:sz="4"/>
+              <w:left w:val="single" w:color="000000" w:sz="4"/>
+              <w:bottom w:val="single" w:color="000000" w:sz="4"/>
+              <w:right w:val="single" w:color="000000" w:sz="4"/>
+            </w:tcBorders>
+            <w:shd w:fill="F5F5F5" w:color="auto" w:val="clear"/>
+            <w:tcMar>
+              <w:top w:type="dxa" w:w="170"/>
+              <w:left w:type="dxa" w:w="170"/>
+              <w:bottom w:type="dxa" w:w="170"/>
+              <w:right w:type="dxa" w:w="170"/>
+            </w:tcMar>
+            <w:vAlign w:val="center"/>
+          </w:tcPr>
+          <w:p>
+            <w:pPr>
+              <w:jc w:val="left"/>
+            </w:pPr>
+            <w:r>
+              <w:rPr>
+                <w:rFonts w:ascii="NanumGothic" w:cs="NanumGothic" w:eastAsia="NanumGothic" w:hAnsi="NanumGothic"/>
+                <w:sz w:val="20"/>
+                <w:szCs w:val="20"/>
+              </w:rPr>
+              <w:t xml:space="preserve"/>
+            </w:r>
+          </w:p>
+        </w:tc>
+        <w:tc>
+          <w:tcPr>
             <w:tcW w:type="dxa" w:w="1247"/>
             <w:tcBorders>
               <w:top w:val="single" w:color="000000" w:sz="4"/>
@@ -3156,38 +3188,6 @@
         <w:tc>
           <w:tcPr>
             <w:tcW w:type="dxa" w:w="1247"/>
-            <w:tcBorders>
-              <w:top w:val="single" w:color="000000" w:sz="4"/>
-              <w:left w:val="single" w:color="000000" w:sz="4"/>
-              <w:bottom w:val="single" w:color="000000" w:sz="4"/>
-              <w:right w:val="single" w:color="000000" w:sz="4"/>
-            </w:tcBorders>
-            <w:shd w:fill="F5F5F5" w:color="auto" w:val="clear"/>
-            <w:tcMar>
-              <w:top w:type="dxa" w:w="170"/>
-              <w:left w:type="dxa" w:w="170"/>
-              <w:bottom w:type="dxa" w:w="170"/>
-              <w:right w:type="dxa" w:w="170"/>
-            </w:tcMar>
-            <w:vAlign w:val="center"/>
-          </w:tcPr>
-          <w:p>
-            <w:pPr>
-              <w:jc w:val="left"/>
-            </w:pPr>
-            <w:r>
-              <w:rPr>
-                <w:rFonts w:ascii="NanumGothic" w:cs="NanumGothic" w:eastAsia="NanumGothic" w:hAnsi="NanumGothic"/>
-                <w:sz w:val="20"/>
-                <w:szCs w:val="20"/>
-              </w:rPr>
-              <w:t xml:space="preserve"/>
-            </w:r>
-          </w:p>
-        </w:tc>
-        <w:tc>
-          <w:tcPr>
-            <w:tcW w:type="dxa" w:w="907"/>
             <w:tcBorders>
               <w:top w:val="single" w:color="000000" w:sz="4"/>
               <w:left w:val="single" w:color="000000" w:sz="4"/>
@@ -3256,39 +3256,71 @@
         </w:tc>
         <w:tc>
           <w:tcPr>
-            <w:tcW w:type="dxa" w:w="3401"/>
-            <w:tcBorders>
-              <w:top w:val="single" w:color="000000" w:sz="4"/>
-              <w:left w:val="single" w:color="000000" w:sz="4"/>
-              <w:bottom w:val="single" w:color="000000" w:sz="4"/>
-              <w:right w:val="single" w:color="000000" w:sz="4"/>
-            </w:tcBorders>
-            <w:shd w:fill="ffffff" w:color="auto" w:val="clear"/>
-            <w:tcMar>
-              <w:top w:type="dxa" w:w="170"/>
-              <w:left w:type="dxa" w:w="170"/>
-              <w:bottom w:type="dxa" w:w="170"/>
-              <w:right w:type="dxa" w:w="170"/>
-            </w:tcMar>
-            <w:vAlign w:val="center"/>
-          </w:tcPr>
-          <w:p>
-            <w:pPr>
-              <w:jc w:val="left"/>
-            </w:pPr>
-            <w:r>
-              <w:rPr>
-                <w:rFonts w:ascii="NanumGothic" w:cs="NanumGothic" w:eastAsia="NanumGothic" w:hAnsi="NanumGothic"/>
-                <w:sz w:val="20"/>
-                <w:szCs w:val="20"/>
-              </w:rPr>
-              <w:t xml:space="preserve"/>
-            </w:r>
-          </w:p>
-        </w:tc>
-        <w:tc>
-          <w:tcPr>
-            <w:tcW w:type="dxa" w:w="2267"/>
+            <w:tcW w:type="dxa" w:w="3061"/>
+            <w:tcBorders>
+              <w:top w:val="single" w:color="000000" w:sz="4"/>
+              <w:left w:val="single" w:color="000000" w:sz="4"/>
+              <w:bottom w:val="single" w:color="000000" w:sz="4"/>
+              <w:right w:val="single" w:color="000000" w:sz="4"/>
+            </w:tcBorders>
+            <w:shd w:fill="ffffff" w:color="auto" w:val="clear"/>
+            <w:tcMar>
+              <w:top w:type="dxa" w:w="170"/>
+              <w:left w:type="dxa" w:w="170"/>
+              <w:bottom w:type="dxa" w:w="170"/>
+              <w:right w:type="dxa" w:w="170"/>
+            </w:tcMar>
+            <w:vAlign w:val="center"/>
+          </w:tcPr>
+          <w:p>
+            <w:pPr>
+              <w:jc w:val="left"/>
+            </w:pPr>
+            <w:r>
+              <w:rPr>
+                <w:rFonts w:ascii="NanumGothic" w:cs="NanumGothic" w:eastAsia="NanumGothic" w:hAnsi="NanumGothic"/>
+                <w:sz w:val="20"/>
+                <w:szCs w:val="20"/>
+              </w:rPr>
+              <w:t xml:space="preserve"/>
+            </w:r>
+          </w:p>
+        </w:tc>
+        <w:tc>
+          <w:tcPr>
+            <w:tcW w:type="dxa" w:w="2040"/>
+            <w:tcBorders>
+              <w:top w:val="single" w:color="000000" w:sz="4"/>
+              <w:left w:val="single" w:color="000000" w:sz="4"/>
+              <w:bottom w:val="single" w:color="000000" w:sz="4"/>
+              <w:right w:val="single" w:color="000000" w:sz="4"/>
+            </w:tcBorders>
+            <w:shd w:fill="ffffff" w:color="auto" w:val="clear"/>
+            <w:tcMar>
+              <w:top w:type="dxa" w:w="170"/>
+              <w:left w:type="dxa" w:w="170"/>
+              <w:bottom w:type="dxa" w:w="170"/>
+              <w:right w:type="dxa" w:w="170"/>
+            </w:tcMar>
+            <w:vAlign w:val="center"/>
+          </w:tcPr>
+          <w:p>
+            <w:pPr>
+              <w:jc w:val="left"/>
+            </w:pPr>
+            <w:r>
+              <w:rPr>
+                <w:rFonts w:ascii="NanumGothic" w:cs="NanumGothic" w:eastAsia="NanumGothic" w:hAnsi="NanumGothic"/>
+                <w:sz w:val="20"/>
+                <w:szCs w:val="20"/>
+              </w:rPr>
+              <w:t xml:space="preserve"/>
+            </w:r>
+          </w:p>
+        </w:tc>
+        <w:tc>
+          <w:tcPr>
+            <w:tcW w:type="dxa" w:w="1474"/>
             <w:tcBorders>
               <w:top w:val="single" w:color="000000" w:sz="4"/>
               <w:left w:val="single" w:color="000000" w:sz="4"/>
@@ -3353,38 +3385,6 @@
         <w:tc>
           <w:tcPr>
             <w:tcW w:type="dxa" w:w="1247"/>
-            <w:tcBorders>
-              <w:top w:val="single" w:color="000000" w:sz="4"/>
-              <w:left w:val="single" w:color="000000" w:sz="4"/>
-              <w:bottom w:val="single" w:color="000000" w:sz="4"/>
-              <w:right w:val="single" w:color="000000" w:sz="4"/>
-            </w:tcBorders>
-            <w:shd w:fill="ffffff" w:color="auto" w:val="clear"/>
-            <w:tcMar>
-              <w:top w:type="dxa" w:w="170"/>
-              <w:left w:type="dxa" w:w="170"/>
-              <w:bottom w:type="dxa" w:w="170"/>
-              <w:right w:type="dxa" w:w="170"/>
-            </w:tcMar>
-            <w:vAlign w:val="center"/>
-          </w:tcPr>
-          <w:p>
-            <w:pPr>
-              <w:jc w:val="left"/>
-            </w:pPr>
-            <w:r>
-              <w:rPr>
-                <w:rFonts w:ascii="NanumGothic" w:cs="NanumGothic" w:eastAsia="NanumGothic" w:hAnsi="NanumGothic"/>
-                <w:sz w:val="20"/>
-                <w:szCs w:val="20"/>
-              </w:rPr>
-              <w:t xml:space="preserve"/>
-            </w:r>
-          </w:p>
-        </w:tc>
-        <w:tc>
-          <w:tcPr>
-            <w:tcW w:type="dxa" w:w="907"/>
             <w:tcBorders>
               <w:top w:val="single" w:color="000000" w:sz="4"/>
               <w:left w:val="single" w:color="000000" w:sz="4"/>
@@ -3416,6 +3416,28 @@
         </w:tc>
       </w:tr>
     </w:tbl>
+    <w:p>
+      <w:pPr>
+        <w:spacing w:after="80" w:before="80"/>
+      </w:pPr>
+      <w:r>
+        <w:t xml:space="preserve"/>
+      </w:r>
+    </w:p>
+    <w:p>
+      <w:pPr>
+        <w:spacing w:after="40" w:before="40"/>
+        <w:jc w:val="left"/>
+      </w:pPr>
+      <w:r>
+        <w:rPr>
+          <w:rFonts w:ascii="NanumGothic" w:cs="NanumGothic" w:eastAsia="NanumGothic" w:hAnsi="NanumGothic"/>
+          <w:sz w:val="20"/>
+          <w:szCs w:val="20"/>
+        </w:rPr>
+        <w:t xml:space="preserve">※ 보존 근거는 법령 조항 또는 내부 규정을 기입. 보존기간 만료 전 승인 후 폐기.</w:t>
+      </w:r>
+    </w:p>
     <w:p>
       <w:pPr>
         <w:spacing w:after="80" w:before="80"/>

</xml_diff>